<commit_message>
Make the engine connection subscriber-configurable; update Post-Install Guide
Mirrors supplierCompliance 3da8584.

1.1.0.1 shipped the Named Credential with a real endpoint baked in, which
Salesforce then refused to let subscribers edit, making Post-Install steps 1.2
and 1.3 impossible. 1.2 ships a non-resolvable placeholder instead. Verified by
building 1.2.0.1, installing into a fresh scratch org and confirming a
subscriber can set both the URL and the bearer token, with a live callout
returning HTTP 200.

The Azure Document Intelligence and Azure OpenAI credential pairs are parked -
no Apex referenced them, and Salesforce never calls Azure directly.

Post-Install Guide updated for 1.2.0.1: the "What Changed" section explains the
credential fix and the removal, Step 1.2 names the placeholder, and Step 1.3
now states plainly that the inbound token is chosen by whoever operates the
engine rather than issued by Azure or Salesforce.

Co-Authored-By: Claude Opus 5 <noreply@anthropic.com>
</commit_message>
<xml_diff>
--- a/docs/Vendor_GRACE_Post_Install_Guide.docx
+++ b/docs/Vendor_GRACE_Post_Install_Guide.docx
@@ -30,7 +30,7 @@
           <w:color w:val="4B5A70"/>
           <w:sz w:val="19"/>
         </w:rPr>
-        <w:t>Version 1.1  |  Package 1.1.0.1  |  Date: September 2026  |  Mirketa Inc. — Salesforce Practice  |  Confidential</w:t>
+        <w:t>Version 1.2  |  Package 1.2.0.1  |  Date: September 2026  |  Mirketa Inc. — Salesforce Practice  |  Confidential</w:t>
       </w:r>
     </w:p>
     <w:p/>
@@ -236,7 +236,7 @@
         <w:ind w:left="360"/>
       </w:pPr>
       <w:r>
-        <w:t>Package version 1.1.0.1 supersedes 1.0.0.2. This section lists what an administrator upgrading from the previous version needs to know. There are no new setup steps and no changes to any step below.</w:t>
+        <w:t>Package version 1.2.0.1 supersedes 1.1.0.1. This section lists what an administrator needs to know. Two changes affect setup directly, both in Section 1.</w:t>
       </w:r>
     </w:p>
     <w:p>
@@ -245,7 +245,7 @@
         <w:ind w:left="360"/>
       </w:pPr>
       <w:r>
-        <w:t>Sub-supplier invitations no longer send a password</w:t>
+        <w:t>The engine connection is now configurable (important)</w:t>
       </w:r>
     </w:p>
     <w:p>
@@ -253,7 +253,7 @@
         <w:ind w:left="360"/>
       </w:pPr>
       <w:r>
-        <w:t>Previously, inviting a sub-supplier created an Experience Cloud portal user, set a temporary password on that user, and included the credentials in the invitation email. That flow has been removed. AppExchange managed packages may not call direct password-management APIs (System.setPassword), so the behaviour could not ship in a released package.</w:t>
+        <w:t>Version 1.1.0.1 shipped the Local Compliance Service Named Credential with a real, pre-filled endpoint URL. Because that value resolved to a live host, Salesforce treated it as managed configuration and refused to let subscribers change it — which made Step 1.2 impossible to complete and left the package unusable. Do not install 1.1.0.1.</w:t>
       </w:r>
     </w:p>
     <w:p>
@@ -261,7 +261,7 @@
         <w:ind w:left="360"/>
       </w:pPr>
       <w:r>
-        <w:t>What still happens: the portal user is still created, so the invitee still has an identity in the org, and the invitation email still contains the tokenised “Accept &amp; Access Supplier Portal” link. That link has always been the primary access path and is unchanged.</w:t>
+        <w:t>From 1.2.0.1 the Named Credential ships with a non-resolvable placeholder (https://example.com), which subscribers can edit normally. Steps 1.2 and 1.3 now work as written. This has been verified end to end: after setting the URL and the bearer token, a live callout to a real engine returned results successfully.</w:t>
       </w:r>
     </w:p>
     <w:p>
@@ -269,7 +269,7 @@
         <w:ind w:left="360"/>
       </w:pPr>
       <w:r>
-        <w:t>What an invitee does differently: they open the portal through the link in their invitation. If they also want a username-and-password login, they use the standard Salesforce password-reset flow on the portal login page. No administrator action is required.</w:t>
+        <w:t>Two unused credentials were removed. Earlier versions shipped Azure Document Intelligence and Azure OpenAI Named Credentials. No Apex ever used them — Salesforce does not call Azure directly; the compliance engine does, using its own configuration. They have been removed from the package. There is nothing to configure in their place.</w:t>
       </w:r>
     </w:p>
     <w:p>
@@ -277,7 +277,7 @@
         <w:ind w:left="360"/>
       </w:pPr>
       <w:r>
-        <w:t>Side effect worth knowing: re-inviting a contact who already has a portal user no longer resets that person's password. Previously every re-invite silently invalidated the password they were already using.</w:t>
+        <w:t>Also in this line (from 1.1.0.1): sub-supplier invitations no longer set or email a temporary password. The portal user is still created and the invitation still carries the tokenised portal link, which has always been the primary access path. An invitee who wants a username-and-password login uses the standard Salesforce password-reset flow. Re-inviting an existing contact no longer resets the password they are already using.</w:t>
       </w:r>
     </w:p>
     <w:p>
@@ -294,7 +294,7 @@
         <w:ind w:left="360"/>
       </w:pPr>
       <w:r>
-        <w:t>The Checkmarx source scan for this version reports no Critical findings. All five Critical categories — Stored XSS, Reflected XSS, SOQL/SOSL Injection, Lightning API Version and Disallowed Password APIs — return “No Issues Found”. The remaining findings are the documented enforcement model described in the Appendix.</w:t>
+        <w:t>The Checkmarx source scan reports no Critical findings. All five Critical categories — Stored XSS, Reflected XSS, SOQL/SOSL Injection, Lightning API Version and Disallowed Password APIs — return “No Issues Found”. The remaining findings are the documented enforcement model described in the Appendix.</w:t>
       </w:r>
     </w:p>
     <w:p>
@@ -311,7 +311,7 @@
         <w:ind w:left="360"/>
       </w:pPr>
       <w:r>
-        <w:t>Upgrading is an in-place package upgrade; no data migration and no configuration changes are required. All Named Credential, External Credential and permission-set configuration from Section 1 carries forward. Existing portal users keep their current passwords.</w:t>
+        <w:t>Upgrading from 1.1.0.1 or 1.0.0.2 is an in-place package upgrade; no data migration is required. If you are upgrading from 1.0.0.2 your existing Named Credential configuration carries forward. If you attempted 1.1.0.1, re-check Steps 1.2 and 1.3 — they can now be completed. Existing portal users keep their current passwords.</w:t>
       </w:r>
     </w:p>
     <w:p>
@@ -393,7 +393,7 @@
           <w:i w:val="0"/>
           <w:sz w:val="22"/>
         </w:rPr>
-        <w:t>The package ships a Named Credential (Local_Compliance_Service) with a placeholder URL. Every org must point this at its own compliance engine deployment.</w:t>
+        <w:t>The package ships the Local_Compliance_Service Named Credential with a placeholder URL of https://example.com. Every org must point this at its own compliance engine deployment. The placeholder is deliberately non-resolvable so that this value stays editable after install.</w:t>
       </w:r>
     </w:p>
     <w:p>
@@ -465,7 +465,7 @@
           <w:i w:val="0"/>
           <w:sz w:val="22"/>
         </w:rPr>
-        <w:t>The engine authenticates inbound Salesforce callouts via a bearer token, held in an External Credential Principal — NOT packaged with a real value (see Appendix for why).</w:t>
+        <w:t>The engine authenticates inbound Salesforce callouts with a shared bearer token. This token is NOT issued by Azure or by Salesforce — it is a secret chosen by whoever operates the engine. If you host the engine yourself, pick any long random string, set it as the INBOUND_TOKEN environment variable on your engine, and enter the same value here. If Mirketa hosts the engine for you, we generate the token and provide it. The two values must match exactly or every callout returns 401.</w:t>
       </w:r>
     </w:p>
     <w:p>
@@ -2451,7 +2451,7 @@
           <w:color w:val="4B5A70"/>
           <w:sz w:val="18"/>
         </w:rPr>
-        <w:t>Vendor GRACE — Post-Installation Setup Guide v1.1  |  Package 1.1.0.1</w:t>
+        <w:t>Vendor GRACE — Post-Installation Setup Guide v1.2  |  Package 1.2.0.1</w:t>
       </w:r>
     </w:p>
     <w:sectPr>

</xml_diff>

<commit_message>
Disable unused Azure credentials; correct the Post-Install Guide
Mirrors supplierCompliance 0c41988 + e24c848.

The two Azure Named Credentials return to the package directory: they cannot
be removed, because 1.0.0.2 and 1.1.0.1 both shipped them and a 2GP managed
package cannot drop metadata a released version already contained without a
Salesforce Partner Community case. They now carry calloutStatus Disabled and a
https://example.com placeholder, so they are inert rather than absent.

The guide previously claimed 1.1.0.1 shipped an uneditable endpoint that 1.2
fixed. That was wrong: the Setup UI edits packaged credentials normally, and
only the Metadata and Tooling APIs refuse. Corrected, with a note to keep
steps 1.2 and 1.3 manual when automating org setup.

1.2.0.3 = 04tPc000000xgUfIAI, 92% coverage, fully validated, ancestor 1.1.0.1.

Co-Authored-By: Claude Opus 5 <noreply@anthropic.com>
</commit_message>
<xml_diff>
--- a/docs/Vendor_GRACE_Post_Install_Guide.docx
+++ b/docs/Vendor_GRACE_Post_Install_Guide.docx
@@ -30,7 +30,7 @@
           <w:color w:val="4B5A70"/>
           <w:sz w:val="19"/>
         </w:rPr>
-        <w:t>Version 1.2  |  Package 1.2.0.1  |  Date: September 2026  |  Mirketa Inc. — Salesforce Practice  |  Confidential</w:t>
+        <w:t>Version 1.2  |  Package 1.2.0.3  |  Date: September 2026  |  Mirketa Inc. — Salesforce Practice  |  Confidential</w:t>
       </w:r>
     </w:p>
     <w:p/>
@@ -236,7 +236,7 @@
         <w:ind w:left="360"/>
       </w:pPr>
       <w:r>
-        <w:t>Package version 1.2.0.1 supersedes 1.1.0.1. This section lists what an administrator needs to know. Two changes affect setup directly, both in Section 1.</w:t>
+        <w:t>Package version 1.2.0.3 supersedes 1.1.0.1. This section lists what an administrator needs to know. None of it changes the setup steps below.</w:t>
       </w:r>
     </w:p>
     <w:p>
@@ -245,7 +245,7 @@
         <w:ind w:left="360"/>
       </w:pPr>
       <w:r>
-        <w:t>The engine connection is now configurable (important)</w:t>
+        <w:t>Engine endpoint and token: configure these in Setup, not by deployment</w:t>
       </w:r>
     </w:p>
     <w:p>
@@ -253,7 +253,7 @@
         <w:ind w:left="360"/>
       </w:pPr>
       <w:r>
-        <w:t>Version 1.1.0.1 shipped the Local Compliance Service Named Credential with a real, pre-filled endpoint URL. Because that value resolved to a live host, Salesforce treated it as managed configuration and refused to let subscribers change it — which made Step 1.2 impossible to complete and left the package unusable. Do not install 1.1.0.1.</w:t>
+        <w:t>Steps 1.2 and 1.3 must be performed through the Salesforce Setup UI. Packaged Named Credentials and External Credentials can be edited there normally. They cannot be changed by a Metadata API or Tooling API deployment — those return “Cannot modify managed object”. If you automate org configuration, make these two steps manual.</w:t>
       </w:r>
     </w:p>
     <w:p>
@@ -261,7 +261,7 @@
         <w:ind w:left="360"/>
       </w:pPr>
       <w:r>
-        <w:t>From 1.2.0.1 the Named Credential ships with a non-resolvable placeholder (https://example.com), which subscribers can edit normally. Steps 1.2 and 1.3 now work as written. This has been verified end to end: after setting the URL and the bearer token, a live callout to a real engine returned results successfully.</w:t>
+        <w:t>Every packaged Named Credential ships with a placeholder URL of https://example.com. Replace the one on Local_Compliance_Service with your own engine endpoint in Setup, and set the matching bearer token on the related External Credential. This has been verified end to end: with both set, a live callout to a real engine returns results successfully.</w:t>
       </w:r>
     </w:p>
     <w:p>
@@ -269,7 +269,7 @@
         <w:ind w:left="360"/>
       </w:pPr>
       <w:r>
-        <w:t>Two unused credentials were removed. Earlier versions shipped Azure Document Intelligence and Azure OpenAI Named Credentials. No Apex ever used them — Salesforce does not call Azure directly; the compliance engine does, using its own configuration. They have been removed from the package. There is nothing to configure in their place.</w:t>
+        <w:t>Two credentials you should leave alone. The package also contains Azure Document Intelligence and Azure OpenAI Named Credentials, left over from an earlier design. No Apex uses them — Salesforce does not call Azure directly; the compliance engine does, from its own configuration. From 1.2.0.3 they ship with their callout status set to Disabled and a placeholder URL. Leave them exactly as they are; configuring them has no effect. They remain in the package because Salesforce does not permit removing components that a released version already shipped, and will be withdrawn in a later release.</w:t>
       </w:r>
     </w:p>
     <w:p>
@@ -311,7 +311,7 @@
         <w:ind w:left="360"/>
       </w:pPr>
       <w:r>
-        <w:t>Upgrading from 1.1.0.1 or 1.0.0.2 is an in-place package upgrade; no data migration is required. If you are upgrading from 1.0.0.2 your existing Named Credential configuration carries forward. If you attempted 1.1.0.1, re-check Steps 1.2 and 1.3 — they can now be completed. Existing portal users keep their current passwords.</w:t>
+        <w:t>Upgrading from 1.1.0.1 or 1.0.0.2 is an in-place package upgrade; no data migration is required. Your existing Named Credential and External Credential configuration carries forward. Existing portal users keep their current passwords.</w:t>
       </w:r>
     </w:p>
     <w:p>
@@ -393,7 +393,7 @@
           <w:i w:val="0"/>
           <w:sz w:val="22"/>
         </w:rPr>
-        <w:t>The package ships the Local_Compliance_Service Named Credential with a placeholder URL of https://example.com. Every org must point this at its own compliance engine deployment. The placeholder is deliberately non-resolvable so that this value stays editable after install.</w:t>
+        <w:t>The package ships the Local_Compliance_Service Named Credential with a placeholder URL of https://example.com. This is the only credential the application uses, and every org must point it at its own compliance engine deployment. Make this change in the Setup UI — a Metadata API deployment will be rejected.</w:t>
       </w:r>
     </w:p>
     <w:p>
@@ -2451,7 +2451,7 @@
           <w:color w:val="4B5A70"/>
           <w:sz w:val="18"/>
         </w:rPr>
-        <w:t>Vendor GRACE — Post-Installation Setup Guide v1.2  |  Package 1.2.0.1</w:t>
+        <w:t>Vendor GRACE — Post-Installation Setup Guide v1.2  |  Package 1.2.0.3</w:t>
       </w:r>
     </w:p>
     <w:sectPr>

</xml_diff>

<commit_message>
Post-Install Guide: make step 1.4 impossible to miss
Mirrors supplierCompliance b7b684a.

The External Credential Principal grant cannot be packaged (retested
2026-09-11: the 2GP build still fails to resolve it), so every subscriber must
do it manually, and skipping it yields an error that never names the missing
grant. Now flagged in five places, with a troubleshooting block covering the
credential-access failure, HTTP 401 and HTTP 500 in the order they occur.

Co-Authored-By: Claude Opus 5 <noreply@anthropic.com>
</commit_message>
<xml_diff>
--- a/docs/Vendor_GRACE_Post_Install_Guide.docx
+++ b/docs/Vendor_GRACE_Post_Install_Guide.docx
@@ -87,7 +87,7 @@
         <w:rPr>
           <w:b/>
         </w:rPr>
-        <w:t>3. Section 1 — Admin / Installer setup   (Admin)</w:t>
+        <w:t>3. Section 1 — Admin / Installer setup   (Admin)   — includes step 1.4, which is required and easily missed</w:t>
       </w:r>
       <w:r>
         <w:rPr>
@@ -315,6 +315,51 @@
       </w:r>
     </w:p>
     <w:p>
+      <w:pPr>
+        <w:pStyle w:val="Heading2"/>
+        <w:ind w:left="360"/>
+      </w:pPr>
+      <w:r>
+        <w:rPr>
+          <w:b w:val="0"/>
+        </w:rPr>
+        <w:t>If callouts fail after setup</w:t>
+      </w:r>
+    </w:p>
+    <w:p>
+      <w:pPr>
+        <w:ind w:left="360"/>
+      </w:pPr>
+      <w:r>
+        <w:rPr>
+          <w:b w:val="0"/>
+        </w:rPr>
+        <w:t>“We couldn’t access the credential(s)…” — step 1.4 was not done, or the user is not assigned the Local_Compliance_Callout permission set. Both are required: the permission set must carry the principal grant, and the user must hold the permission set.</w:t>
+      </w:r>
+    </w:p>
+    <w:p>
+      <w:pPr>
+        <w:ind w:left="360"/>
+      </w:pPr>
+      <w:r>
+        <w:rPr>
+          <w:b w:val="0"/>
+        </w:rPr>
+        <w:t>“HTTP 401: Invalid or missing token” — the Authorization value on the External Credential must be the word Bearer, one space, then the token (Bearer abc123…), not the token on its own. The engine compares the whole header.</w:t>
+      </w:r>
+    </w:p>
+    <w:p>
+      <w:pPr>
+        <w:ind w:left="360"/>
+      </w:pPr>
+      <w:r>
+        <w:rPr>
+          <w:b w:val="0"/>
+        </w:rPr>
+        <w:t>“HTTP 500: Internal Server Error” — the callout reached the engine and the engine failed. This is an engine-side problem, not a Salesforce one; check the engine deployment and its database schema.</w:t>
+      </w:r>
+    </w:p>
+    <w:p>
       <w:r>
         <w:br w:type="page"/>
       </w:r>
@@ -337,7 +382,7 @@
           <w:i w:val="0"/>
           <w:sz w:val="22"/>
         </w:rPr>
-        <w:t>Performed once, by the Salesforce Administrator installing the package. Complete these steps in order — later steps depend on earlier ones.</w:t>
+        <w:t>Performed once, by the Salesforce Administrator installing the package. Complete these steps in order — later steps depend on earlier ones. Step 1.4 is the one most often missed: without it every engine callout fails, and the error it produces does not say which step was skipped.</w:t>
       </w:r>
     </w:p>
     <w:p>
@@ -516,17 +561,35 @@
         <w:rPr>
           <w:color w:val="03234B"/>
         </w:rPr>
-        <w:t>1.4  Grant the External Credential Principal to users</w:t>
+        <w:t>1.4  Grant the External Credential Principal   —  REQUIRED, NOTHING WORKS WITHOUT IT</w:t>
       </w:r>
     </w:p>
     <w:p>
       <w:r>
         <w:rPr>
-          <w:b w:val="0"/>
+          <w:b/>
           <w:i w:val="0"/>
           <w:sz w:val="22"/>
         </w:rPr>
-        <w:t>This step is required because Salesforce does not allow packaged Permission Sets to grant External Credential Principal access (see Appendix).</w:t>
+        <w:t>Do not skip this step. Salesforce does not permit a packaged Permission Set to grant External Credential Principal access, so the package cannot do it for you (see Appendix). Until an administrator performs it by hand, every callout to the compliance engine fails and no AI assessment, document scoping or screening will run.</w:t>
+      </w:r>
+    </w:p>
+    <w:p>
+      <w:pPr/>
+      <w:r>
+        <w:rPr>
+          <w:b w:val="0"/>
+        </w:rPr>
+        <w:t>If you skipped it, the application reports: “We couldn’t access the credential(s). You might not have the required permissions, or the external credential ‘Local_Compliance_Auth’ might not exist.” That message does not name the missing grant — this step is the fix.</w:t>
+      </w:r>
+    </w:p>
+    <w:p>
+      <w:pPr/>
+      <w:r>
+        <w:rPr>
+          <w:b w:val="0"/>
+        </w:rPr>
+        <w:t>Note: none of the five packaged permission sets carries this grant, and none will appear to be missing anything. The grant is invisible until you open the permission set and look at External Credential Principal Access.</w:t>
       </w:r>
     </w:p>
     <w:p>

</xml_diff>